<commit_message>
Restore buoy motion dashboard section
</commit_message>
<xml_diff>
--- a/THESIS DOCUMENTATION/PROJECT FALCON-01 - V3 ADVISER REVISED.docx
+++ b/THESIS DOCUMENTATION/PROJECT FALCON-01 - V3 ADVISER REVISED.docx
@@ -163,7 +163,7 @@
         <w:ind w:left="360"/>
       </w:pPr>
       <w:r>
-        <w:t>4. How clearly can a three-page local dashboard communicate wave, environment, GPS, power, security, health, and alert information?</w:t>
+        <w:t>4. How clearly can a four-page local dashboard communicate wave, environment, GPS, power, security, health, and alert information?</w:t>
       </w:r>
     </w:p>
     <w:p>
@@ -292,7 +292,7 @@
         <w:ind w:left="360"/>
       </w:pPr>
       <w:r>
-        <w:t>5. Develop a responsive dashboard with only Overview, Sensors, and Logs &amp; Alerts as primary pages.</w:t>
+        <w:t>5. Develop a responsive dashboard with Overview, Buoy Motion, Sensors, and Logs &amp; Alerts as primary pages while keeping motion visualization optional.</w:t>
       </w:r>
     </w:p>
     <w:p>
@@ -1282,7 +1282,7 @@
         <w:ind w:left="360"/>
       </w:pPr>
       <w:r>
-        <w:t>2. Sensors: grouped core, supporting, health, and security channels with units, quality, source, update age, and calibration status.</w:t>
+        <w:t>2. Buoy Motion: optional interactive 3D response model driven by estimated sea context, not a required IMU measurement.</w:t>
       </w:r>
     </w:p>
     <w:p>
@@ -1291,7 +1291,16 @@
         <w:ind w:left="360"/>
       </w:pPr>
       <w:r>
-        <w:t>3. Logs &amp; Alerts: current warnings, security/calibration/operator events, persisted telemetry, acknowledgement, search, and export.</w:t>
+        <w:t>3. Sensors: grouped core, supporting, health, and security channels with units, quality, source, update age, and calibration status.</w:t>
+      </w:r>
+    </w:p>
+    <w:p>
+      <w:pPr>
+        <w:spacing w:line="360" w:lineRule="auto"/>
+        <w:ind w:left="360"/>
+      </w:pPr>
+      <w:r>
+        <w:t>4. Logs &amp; Alerts: current warnings, security/calibration/operator events, persisted telemetry, acknowledgement, search, and export.</w:t>
       </w:r>
     </w:p>
     <w:p>
@@ -1578,7 +1587,7 @@
         <w:jc w:val="both"/>
       </w:pPr>
       <w:r>
-        <w:t>The repository currently includes the ESP32 firmware shell, diagnostic portal, versioned serial frame, Python simulator/edge service, SQLite storage, deterministic alerts, grouped API, three-page dashboard, optional assistant, and optional presentation prediction. The software build and automated tests demonstrate implementation behavior only. They do not prove physical sensor accuracy or coastal readiness.</w:t>
+        <w:t>The repository currently includes the ESP32 firmware shell, diagnostic portal, versioned serial frame, Python simulator/edge service, SQLite storage, deterministic alerts, grouped API, four-page dashboard, optional motion visualization, optional assistant, and optional presentation prediction. The software build and automated tests demonstrate implementation behavior only. They do not prove physical sensor accuracy or coastal readiness.</w:t>
       </w:r>
     </w:p>
     <w:p>

</xml_diff>

<commit_message>
Simplify sensors into operator groups
</commit_message>
<xml_diff>
--- a/THESIS DOCUMENTATION/PROJECT FALCON-01 - V3 ADVISER REVISED.docx
+++ b/THESIS DOCUMENTATION/PROJECT FALCON-01 - V3 ADVISER REVISED.docx
@@ -1291,7 +1291,7 @@
         <w:ind w:left="360"/>
       </w:pPr>
       <w:r>
-        <w:t>3. Sensors: grouped core, supporting, health, and security channels with units, quality, source, update age, and calibration status.</w:t>
+        <w:t>3. Sensors: six user-facing groups—Wave &amp; Pressure, GPS &amp; Security, Wind, Water, Power, and System—with exact hardware, quality, source, update age, sampling, and calibration diagnostics available through expandable details.</w:t>
       </w:r>
     </w:p>
     <w:p>
@@ -1310,7 +1310,7 @@
         <w:jc w:val="both"/>
       </w:pPr>
       <w:r>
-        <w:t>Settings is a compact header icon. Optional AI is hidden by default. The FALCON Assistant is a rule-based animation with NORMAL, WARNING, ALERT, and OFFLINE states; it is not a chatbot or autonomous decision-maker.</w:t>
+        <w:t>Settings is a compact header icon. Optional AI is hidden by default. The saved FALCON Assistant concept is also hidden while its final operator design is under review; it is not a chatbot or autonomous decision-maker.</w:t>
       </w:r>
     </w:p>
     <w:p>

</xml_diff>